<commit_message>
Finalized Planning and Design.
Part 1 Complete.
</commit_message>
<xml_diff>
--- a/Documentation/Emerald Wallet - Planning & Design.docx
+++ b/Documentation/Emerald Wallet - Planning & Design.docx
@@ -294,6 +294,90 @@
       </w:pPr>
       <w:r>
         <w:lastRenderedPageBreak/>
+        <w:t>Development Team</w:t>
+      </w:r>
+    </w:p>
+    <w:p>
+      <w:pPr>
+        <w:pStyle w:val="VCText"/>
+        <w:numPr>
+          <w:ilvl w:val="0"/>
+          <w:numId w:val="30"/>
+        </w:numPr>
+      </w:pPr>
+      <w:r>
+        <w:t>Kaehil Indurjeeth (ST10438880)</w:t>
+      </w:r>
+    </w:p>
+    <w:p>
+      <w:pPr>
+        <w:pStyle w:val="VCText"/>
+        <w:numPr>
+          <w:ilvl w:val="0"/>
+          <w:numId w:val="30"/>
+        </w:numPr>
+      </w:pPr>
+      <w:r>
+        <w:t>Kyra Naidoo (ST10448414)</w:t>
+      </w:r>
+    </w:p>
+    <w:p>
+      <w:pPr>
+        <w:pStyle w:val="VCText"/>
+        <w:numPr>
+          <w:ilvl w:val="0"/>
+          <w:numId w:val="30"/>
+        </w:numPr>
+      </w:pPr>
+      <w:r>
+        <w:t>Gregory Luyckfasseel (ST10441344)</w:t>
+      </w:r>
+    </w:p>
+    <w:p>
+      <w:pPr>
+        <w:pStyle w:val="VCText"/>
+        <w:numPr>
+          <w:ilvl w:val="0"/>
+          <w:numId w:val="30"/>
+        </w:numPr>
+      </w:pPr>
+      <w:r>
+        <w:t>Zario Di Paolo (ST1044134</w:t>
+      </w:r>
+      <w:r>
+        <w:t>9)</w:t>
+      </w:r>
+    </w:p>
+    <w:p>
+      <w:pPr>
+        <w:pStyle w:val="VCText"/>
+        <w:numPr>
+          <w:ilvl w:val="0"/>
+          <w:numId w:val="30"/>
+        </w:numPr>
+      </w:pPr>
+      <w:r>
+        <w:t>Diya Lakha (ST10439176)</w:t>
+      </w:r>
+    </w:p>
+    <w:p>
+      <w:pPr>
+        <w:rPr>
+          <w:rFonts w:ascii="Calibri" w:hAnsi="Calibri"/>
+          <w:b/>
+          <w:sz w:val="48"/>
+        </w:rPr>
+      </w:pPr>
+      <w:r>
+        <w:br w:type="page"/>
+      </w:r>
+    </w:p>
+    <w:p>
+      <w:pPr>
+        <w:pStyle w:val="VCHeading"/>
+      </w:pPr>
+      <w:r>
+        <w:lastRenderedPageBreak/>
         <w:t>Introduction</w:t>
       </w:r>
     </w:p>
@@ -318,31 +402,7 @@
         <w:pStyle w:val="VCText"/>
       </w:pPr>
       <w:r>
-        <w:t xml:space="preserve">The design of Emerald Wallet is informed by features found in established personal finance applications such as YNAB (You Need </w:t>
-      </w:r>
-      <w:proofErr w:type="gramStart"/>
-      <w:r>
-        <w:t>A</w:t>
-      </w:r>
-      <w:proofErr w:type="gramEnd"/>
-      <w:r>
-        <w:t xml:space="preserve"> Budget), </w:t>
-      </w:r>
-      <w:proofErr w:type="spellStart"/>
-      <w:r>
-        <w:t>Goodbudget</w:t>
-      </w:r>
-      <w:proofErr w:type="spellEnd"/>
-      <w:r>
-        <w:t xml:space="preserve">, and </w:t>
-      </w:r>
-      <w:proofErr w:type="spellStart"/>
-      <w:r>
-        <w:t>Simplifi</w:t>
-      </w:r>
-      <w:proofErr w:type="spellEnd"/>
-      <w:r>
-        <w:t>. These systems demonstrate effective methods for helping users allocate money, visualize budgets, and maintain financial discipline.</w:t>
+        <w:t>The design of Emerald Wallet is informed by features found in established personal finance applications such as YNAB (You Need A Budget), Goodbudget, and Simplifi. These systems demonstrate effective methods for helping users allocate money, visualize budgets, and maintain financial discipline.</w:t>
       </w:r>
     </w:p>
     <w:p>
@@ -542,23 +602,7 @@
           <w:b/>
           <w:bCs/>
         </w:rPr>
-        <w:t>Model–View–</w:t>
-      </w:r>
-      <w:proofErr w:type="spellStart"/>
-      <w:r>
-        <w:rPr>
-          <w:b/>
-          <w:bCs/>
-        </w:rPr>
-        <w:t>ViewModel</w:t>
-      </w:r>
-      <w:proofErr w:type="spellEnd"/>
-      <w:r>
-        <w:rPr>
-          <w:b/>
-          <w:bCs/>
-        </w:rPr>
-        <w:t xml:space="preserve"> (MVVM)</w:t>
+        <w:t>Model–View–ViewModel (MVVM)</w:t>
       </w:r>
       <w:r>
         <w:t xml:space="preserve"> architecture. This pattern separates the user interface from business logic and data management, improving maintainability and testability.</w:t>
@@ -629,23 +673,7 @@
           <w:b/>
           <w:bCs/>
         </w:rPr>
-        <w:t xml:space="preserve">YNAB (You Need </w:t>
-      </w:r>
-      <w:proofErr w:type="gramStart"/>
-      <w:r>
-        <w:rPr>
-          <w:b/>
-          <w:bCs/>
-        </w:rPr>
-        <w:t>A</w:t>
-      </w:r>
-      <w:proofErr w:type="gramEnd"/>
-      <w:r>
-        <w:rPr>
-          <w:b/>
-          <w:bCs/>
-        </w:rPr>
-        <w:t xml:space="preserve"> Budget)</w:t>
+        <w:t>YNAB (You Need A Budget)</w:t>
       </w:r>
       <w:r>
         <w:t xml:space="preserve"> follows a zero-based budgeting strategy where users assign every unit of income to a category or purpose. This approach ensures that users are aware of how all their money is allocated and prevents overspending (YNAB, 2024).</w:t>
@@ -686,7 +714,6 @@
       <w:r>
         <w:t xml:space="preserve">The budgeting system used by </w:t>
       </w:r>
-      <w:proofErr w:type="spellStart"/>
       <w:r>
         <w:rPr>
           <w:b/>
@@ -694,17 +721,8 @@
         </w:rPr>
         <w:t>Goodbudget</w:t>
       </w:r>
-      <w:proofErr w:type="spellEnd"/>
-      <w:r>
-        <w:t xml:space="preserve"> is based on the envelope budgeting method, where users divide money into spending envelopes representing categories such as groceries or transportation (</w:t>
-      </w:r>
-      <w:proofErr w:type="spellStart"/>
-      <w:r>
-        <w:t>Goodbudget</w:t>
-      </w:r>
-      <w:proofErr w:type="spellEnd"/>
-      <w:r>
-        <w:t>, 2024).</w:t>
+      <w:r>
+        <w:t xml:space="preserve"> is based on the envelope budgeting method, where users divide money into spending envelopes representing categories such as groceries or transportation (Goodbudget, 2024).</w:t>
       </w:r>
     </w:p>
     <w:p>
@@ -739,7 +757,6 @@
       <w:pPr>
         <w:pStyle w:val="VCText"/>
       </w:pPr>
-      <w:proofErr w:type="spellStart"/>
       <w:r>
         <w:rPr>
           <w:b/>
@@ -747,7 +764,6 @@
         </w:rPr>
         <w:t>Simplifi</w:t>
       </w:r>
-      <w:proofErr w:type="spellEnd"/>
       <w:r>
         <w:t xml:space="preserve"> emphasizes spending plans and financial dashboards that allow users to monitor how their expenses compare with planned budgets (Quicken, 2024).</w:t>
       </w:r>
@@ -858,7 +874,7 @@
         </w:numPr>
       </w:pPr>
       <w:r>
-        <w:t>Username</w:t>
+        <w:t>Full name</w:t>
       </w:r>
     </w:p>
     <w:p>
@@ -1956,15 +1972,7 @@
         <w:pStyle w:val="VCText"/>
       </w:pPr>
       <w:r>
-        <w:t xml:space="preserve">Users must be able to view expenses over a user-selected </w:t>
-      </w:r>
-      <w:proofErr w:type="gramStart"/>
-      <w:r>
-        <w:t>time period</w:t>
-      </w:r>
-      <w:proofErr w:type="gramEnd"/>
-      <w:r>
-        <w:t>.</w:t>
+        <w:t>Users must be able to view expenses over a user-selected time period.</w:t>
       </w:r>
     </w:p>
     <w:p>
@@ -2116,15 +2124,7 @@
         <w:pStyle w:val="VCText"/>
       </w:pPr>
       <w:r>
-        <w:t xml:space="preserve">Users must be able to view the total amount spent per category within a selected </w:t>
-      </w:r>
-      <w:proofErr w:type="gramStart"/>
-      <w:r>
-        <w:t>time period</w:t>
-      </w:r>
-      <w:proofErr w:type="gramEnd"/>
-      <w:r>
-        <w:t>.</w:t>
+        <w:t>Users must be able to view the total amount spent per category within a selected time period.</w:t>
       </w:r>
     </w:p>
     <w:p>
@@ -2154,15 +2154,7 @@
         </w:numPr>
       </w:pPr>
       <w:r>
-        <w:t xml:space="preserve">Selected </w:t>
-      </w:r>
-      <w:proofErr w:type="gramStart"/>
-      <w:r>
-        <w:t>time period</w:t>
-      </w:r>
-      <w:proofErr w:type="gramEnd"/>
-      <w:r>
-        <w:t>.</w:t>
+        <w:t>Selected time period.</w:t>
       </w:r>
     </w:p>
     <w:p>
@@ -2879,7 +2871,6 @@
           <w:szCs w:val="28"/>
         </w:rPr>
       </w:pPr>
-      <w:proofErr w:type="spellStart"/>
       <w:r>
         <w:rPr>
           <w:b/>
@@ -2889,7 +2880,6 @@
         </w:rPr>
         <w:t>ViewModel</w:t>
       </w:r>
-      <w:proofErr w:type="spellEnd"/>
     </w:p>
     <w:p>
       <w:pPr>
@@ -3081,6 +3071,9 @@
       <w:pPr>
         <w:pStyle w:val="VCText"/>
       </w:pPr>
+      <w:r>
+        <w:t>A Microsoft Project Document and a PDF adaption of the Gantt Chart may be found in the GitHub repository for this project.</w:t>
+      </w:r>
     </w:p>
     <w:p>
       <w:pPr>
@@ -3119,13 +3112,511 @@
       </w:pPr>
       <w:r>
         <w:lastRenderedPageBreak/>
-        <w:t xml:space="preserve">Interface </w:t>
-      </w:r>
-      <w:proofErr w:type="spellStart"/>
-      <w:r>
-        <w:t>Mockups</w:t>
-      </w:r>
-      <w:proofErr w:type="spellEnd"/>
+        <w:t>Interface Mockups</w:t>
+      </w:r>
+    </w:p>
+    <w:p>
+      <w:pPr>
+        <w:pStyle w:val="VCText"/>
+      </w:pPr>
+      <w:r>
+        <w:t>Referenced below is the GitHub repository with the source code for the following mockups. Dark mode support will be implemented along with colour correction during development.</w:t>
+      </w:r>
+    </w:p>
+    <w:p>
+      <w:pPr>
+        <w:pStyle w:val="VCText"/>
+      </w:pPr>
+      <w:hyperlink r:id="rId8" w:history="1">
+        <w:r>
+          <w:rPr>
+            <w:rStyle w:val="Hyperlink"/>
+          </w:rPr>
+          <w:t>https://github.com/Gregory-Luyckfasseel/Emerald-Wallet-Mockups</w:t>
+        </w:r>
+      </w:hyperlink>
+      <w:r>
+        <w:t xml:space="preserve"> </w:t>
+      </w:r>
+    </w:p>
+    <w:p>
+      <w:pPr>
+        <w:pStyle w:val="VCText"/>
+      </w:pPr>
+      <w:r>
+        <w:drawing>
+          <wp:inline distT="0" distB="0" distL="0" distR="0" wp14:anchorId="46764EAA" wp14:editId="43B4A76D">
+            <wp:extent cx="3381847" cy="5296639"/>
+            <wp:effectExtent l="0" t="0" r="9525" b="0"/>
+            <wp:docPr id="6" name="Picture 6"/>
+            <wp:cNvGraphicFramePr>
+              <a:graphicFrameLocks xmlns:a="http://schemas.openxmlformats.org/drawingml/2006/main" noChangeAspect="1"/>
+            </wp:cNvGraphicFramePr>
+            <a:graphic xmlns:a="http://schemas.openxmlformats.org/drawingml/2006/main">
+              <a:graphicData uri="http://schemas.openxmlformats.org/drawingml/2006/picture">
+                <pic:pic xmlns:pic="http://schemas.openxmlformats.org/drawingml/2006/picture">
+                  <pic:nvPicPr>
+                    <pic:cNvPr id="1" name=""/>
+                    <pic:cNvPicPr/>
+                  </pic:nvPicPr>
+                  <pic:blipFill>
+                    <a:blip r:embed="rId9"/>
+                    <a:stretch>
+                      <a:fillRect/>
+                    </a:stretch>
+                  </pic:blipFill>
+                  <pic:spPr>
+                    <a:xfrm>
+                      <a:off x="0" y="0"/>
+                      <a:ext cx="3381847" cy="5296639"/>
+                    </a:xfrm>
+                    <a:prstGeom prst="rect">
+                      <a:avLst/>
+                    </a:prstGeom>
+                  </pic:spPr>
+                </pic:pic>
+              </a:graphicData>
+            </a:graphic>
+          </wp:inline>
+        </w:drawing>
+      </w:r>
+    </w:p>
+    <w:p>
+      <w:pPr>
+        <w:pStyle w:val="VCText"/>
+      </w:pPr>
+      <w:r>
+        <w:t>Login screen: This is the entry point to the application. This screen allows users to login by filling in the email and password fields which is then authenticated against the accounts already created for application. For new users, the screen features an option to register an account through a clean, branded interface.</w:t>
+      </w:r>
+    </w:p>
+    <w:p>
+      <w:pPr>
+        <w:pStyle w:val="VCText"/>
+      </w:pPr>
+      <w:r>
+        <w:lastRenderedPageBreak/>
+        <w:drawing>
+          <wp:inline distT="0" distB="0" distL="0" distR="0" wp14:anchorId="0487C802" wp14:editId="6810AC2C">
+            <wp:extent cx="3677163" cy="6354062"/>
+            <wp:effectExtent l="0" t="0" r="0" b="8890"/>
+            <wp:docPr id="7" name="Picture 7"/>
+            <wp:cNvGraphicFramePr>
+              <a:graphicFrameLocks xmlns:a="http://schemas.openxmlformats.org/drawingml/2006/main" noChangeAspect="1"/>
+            </wp:cNvGraphicFramePr>
+            <a:graphic xmlns:a="http://schemas.openxmlformats.org/drawingml/2006/main">
+              <a:graphicData uri="http://schemas.openxmlformats.org/drawingml/2006/picture">
+                <pic:pic xmlns:pic="http://schemas.openxmlformats.org/drawingml/2006/picture">
+                  <pic:nvPicPr>
+                    <pic:cNvPr id="1" name=""/>
+                    <pic:cNvPicPr/>
+                  </pic:nvPicPr>
+                  <pic:blipFill>
+                    <a:blip r:embed="rId10"/>
+                    <a:stretch>
+                      <a:fillRect/>
+                    </a:stretch>
+                  </pic:blipFill>
+                  <pic:spPr>
+                    <a:xfrm>
+                      <a:off x="0" y="0"/>
+                      <a:ext cx="3677163" cy="6354062"/>
+                    </a:xfrm>
+                    <a:prstGeom prst="rect">
+                      <a:avLst/>
+                    </a:prstGeom>
+                  </pic:spPr>
+                </pic:pic>
+              </a:graphicData>
+            </a:graphic>
+          </wp:inline>
+        </w:drawing>
+      </w:r>
+    </w:p>
+    <w:p>
+      <w:pPr>
+        <w:pStyle w:val="VCText"/>
+      </w:pPr>
+      <w:r>
+        <w:t>Register screen: This screen allows users to create an account through a structured form that captures their full name, email address, and password. If the user already has an account, they can easily be redirected back to the login screen.</w:t>
+      </w:r>
+    </w:p>
+    <w:p>
+      <w:pPr>
+        <w:pStyle w:val="VCText"/>
+      </w:pPr>
+      <w:r>
+        <w:lastRenderedPageBreak/>
+        <w:drawing>
+          <wp:inline distT="0" distB="0" distL="0" distR="0" wp14:anchorId="62A9FDB5" wp14:editId="2E76EDE9">
+            <wp:extent cx="3667637" cy="6287377"/>
+            <wp:effectExtent l="0" t="0" r="9525" b="0"/>
+            <wp:docPr id="5" name="Picture 5"/>
+            <wp:cNvGraphicFramePr>
+              <a:graphicFrameLocks xmlns:a="http://schemas.openxmlformats.org/drawingml/2006/main" noChangeAspect="1"/>
+            </wp:cNvGraphicFramePr>
+            <a:graphic xmlns:a="http://schemas.openxmlformats.org/drawingml/2006/main">
+              <a:graphicData uri="http://schemas.openxmlformats.org/drawingml/2006/picture">
+                <pic:pic xmlns:pic="http://schemas.openxmlformats.org/drawingml/2006/picture">
+                  <pic:nvPicPr>
+                    <pic:cNvPr id="1" name=""/>
+                    <pic:cNvPicPr/>
+                  </pic:nvPicPr>
+                  <pic:blipFill>
+                    <a:blip r:embed="rId11"/>
+                    <a:stretch>
+                      <a:fillRect/>
+                    </a:stretch>
+                  </pic:blipFill>
+                  <pic:spPr>
+                    <a:xfrm>
+                      <a:off x="0" y="0"/>
+                      <a:ext cx="3667637" cy="6287377"/>
+                    </a:xfrm>
+                    <a:prstGeom prst="rect">
+                      <a:avLst/>
+                    </a:prstGeom>
+                  </pic:spPr>
+                </pic:pic>
+              </a:graphicData>
+            </a:graphic>
+          </wp:inline>
+        </w:drawing>
+      </w:r>
+    </w:p>
+    <w:p>
+      <w:pPr>
+        <w:pStyle w:val="VCText"/>
+      </w:pPr>
+      <w:r>
+        <w:t>Dashboard screen: This screen is the central hub of the application which shows a quick view of the user’s financial health including their current balance, a progress bar of their monthly budget and a list of recent transactions. Below are quick action buttons that direct the user to other sections of the application.</w:t>
+      </w:r>
+    </w:p>
+    <w:p>
+      <w:pPr>
+        <w:pStyle w:val="VCText"/>
+      </w:pPr>
+      <w:r>
+        <w:lastRenderedPageBreak/>
+        <w:drawing>
+          <wp:inline distT="0" distB="0" distL="0" distR="0" wp14:anchorId="2391BF5D" wp14:editId="296723B6">
+            <wp:extent cx="3419952" cy="5915851"/>
+            <wp:effectExtent l="0" t="0" r="9525" b="8890"/>
+            <wp:docPr id="4" name="Picture 4"/>
+            <wp:cNvGraphicFramePr>
+              <a:graphicFrameLocks xmlns:a="http://schemas.openxmlformats.org/drawingml/2006/main" noChangeAspect="1"/>
+            </wp:cNvGraphicFramePr>
+            <a:graphic xmlns:a="http://schemas.openxmlformats.org/drawingml/2006/main">
+              <a:graphicData uri="http://schemas.openxmlformats.org/drawingml/2006/picture">
+                <pic:pic xmlns:pic="http://schemas.openxmlformats.org/drawingml/2006/picture">
+                  <pic:nvPicPr>
+                    <pic:cNvPr id="1" name=""/>
+                    <pic:cNvPicPr/>
+                  </pic:nvPicPr>
+                  <pic:blipFill>
+                    <a:blip r:embed="rId12"/>
+                    <a:stretch>
+                      <a:fillRect/>
+                    </a:stretch>
+                  </pic:blipFill>
+                  <pic:spPr>
+                    <a:xfrm>
+                      <a:off x="0" y="0"/>
+                      <a:ext cx="3419952" cy="5915851"/>
+                    </a:xfrm>
+                    <a:prstGeom prst="rect">
+                      <a:avLst/>
+                    </a:prstGeom>
+                  </pic:spPr>
+                </pic:pic>
+              </a:graphicData>
+            </a:graphic>
+          </wp:inline>
+        </w:drawing>
+      </w:r>
+    </w:p>
+    <w:p>
+      <w:pPr>
+        <w:pStyle w:val="VCText"/>
+      </w:pPr>
+      <w:r>
+        <w:t>Add expense screen: This screen serves for the user to record transactions. It includes fields for the title of the transaction, the amount, category of spending and the date of the transaction.</w:t>
+      </w:r>
+    </w:p>
+    <w:p>
+      <w:pPr>
+        <w:pStyle w:val="VCText"/>
+      </w:pPr>
+      <w:r>
+        <w:lastRenderedPageBreak/>
+        <w:drawing>
+          <wp:inline distT="0" distB="0" distL="0" distR="0" wp14:anchorId="74D1B72F" wp14:editId="2C6D7D83">
+            <wp:extent cx="3381847" cy="7449590"/>
+            <wp:effectExtent l="0" t="0" r="9525" b="0"/>
+            <wp:docPr id="8" name="Picture 8"/>
+            <wp:cNvGraphicFramePr>
+              <a:graphicFrameLocks xmlns:a="http://schemas.openxmlformats.org/drawingml/2006/main" noChangeAspect="1"/>
+            </wp:cNvGraphicFramePr>
+            <a:graphic xmlns:a="http://schemas.openxmlformats.org/drawingml/2006/main">
+              <a:graphicData uri="http://schemas.openxmlformats.org/drawingml/2006/picture">
+                <pic:pic xmlns:pic="http://schemas.openxmlformats.org/drawingml/2006/picture">
+                  <pic:nvPicPr>
+                    <pic:cNvPr id="1" name=""/>
+                    <pic:cNvPicPr/>
+                  </pic:nvPicPr>
+                  <pic:blipFill>
+                    <a:blip r:embed="rId13"/>
+                    <a:stretch>
+                      <a:fillRect/>
+                    </a:stretch>
+                  </pic:blipFill>
+                  <pic:spPr>
+                    <a:xfrm>
+                      <a:off x="0" y="0"/>
+                      <a:ext cx="3381847" cy="7449590"/>
+                    </a:xfrm>
+                    <a:prstGeom prst="rect">
+                      <a:avLst/>
+                    </a:prstGeom>
+                  </pic:spPr>
+                </pic:pic>
+              </a:graphicData>
+            </a:graphic>
+          </wp:inline>
+        </w:drawing>
+      </w:r>
+    </w:p>
+    <w:p>
+      <w:pPr>
+        <w:pStyle w:val="VCText"/>
+      </w:pPr>
+      <w:r>
+        <w:t>Reports screen: The reports screen utilises a bar graph and pie chart to help users visual their spending and analyse it by showing how much a user is spending in each category so they can identify where their money is being spent.</w:t>
+      </w:r>
+    </w:p>
+    <w:p>
+      <w:pPr>
+        <w:pStyle w:val="VCText"/>
+      </w:pPr>
+      <w:r>
+        <w:lastRenderedPageBreak/>
+        <w:drawing>
+          <wp:inline distT="0" distB="0" distL="0" distR="0" wp14:anchorId="7F74D2BE" wp14:editId="3FC5C027">
+            <wp:extent cx="3429479" cy="5058481"/>
+            <wp:effectExtent l="0" t="0" r="0" b="0"/>
+            <wp:docPr id="9" name="Picture 9"/>
+            <wp:cNvGraphicFramePr>
+              <a:graphicFrameLocks xmlns:a="http://schemas.openxmlformats.org/drawingml/2006/main" noChangeAspect="1"/>
+            </wp:cNvGraphicFramePr>
+            <a:graphic xmlns:a="http://schemas.openxmlformats.org/drawingml/2006/main">
+              <a:graphicData uri="http://schemas.openxmlformats.org/drawingml/2006/picture">
+                <pic:pic xmlns:pic="http://schemas.openxmlformats.org/drawingml/2006/picture">
+                  <pic:nvPicPr>
+                    <pic:cNvPr id="1" name=""/>
+                    <pic:cNvPicPr/>
+                  </pic:nvPicPr>
+                  <pic:blipFill>
+                    <a:blip r:embed="rId14"/>
+                    <a:stretch>
+                      <a:fillRect/>
+                    </a:stretch>
+                  </pic:blipFill>
+                  <pic:spPr>
+                    <a:xfrm>
+                      <a:off x="0" y="0"/>
+                      <a:ext cx="3429479" cy="5058481"/>
+                    </a:xfrm>
+                    <a:prstGeom prst="rect">
+                      <a:avLst/>
+                    </a:prstGeom>
+                  </pic:spPr>
+                </pic:pic>
+              </a:graphicData>
+            </a:graphic>
+          </wp:inline>
+        </w:drawing>
+      </w:r>
+    </w:p>
+    <w:p>
+      <w:pPr>
+        <w:pStyle w:val="VCText"/>
+      </w:pPr>
+      <w:r>
+        <w:t>Goals screen: This is the users screen for keeping track of long-term spending goals. It displays the progress that the user has made in saving towards their active goals by using a progress bar for the user to easily visualise how much more they need to save. Each goal may be clicked on to edit them and the button on the top right is used for adding a new goal to the list.</w:t>
+      </w:r>
+    </w:p>
+    <w:p>
+      <w:pPr>
+        <w:pStyle w:val="VCText"/>
+      </w:pPr>
+      <w:r>
+        <w:lastRenderedPageBreak/>
+        <w:drawing>
+          <wp:inline distT="0" distB="0" distL="0" distR="0" wp14:anchorId="20697F32" wp14:editId="0A4171A4">
+            <wp:extent cx="3648584" cy="5563376"/>
+            <wp:effectExtent l="0" t="0" r="9525" b="0"/>
+            <wp:docPr id="10" name="Picture 10"/>
+            <wp:cNvGraphicFramePr>
+              <a:graphicFrameLocks xmlns:a="http://schemas.openxmlformats.org/drawingml/2006/main" noChangeAspect="1"/>
+            </wp:cNvGraphicFramePr>
+            <a:graphic xmlns:a="http://schemas.openxmlformats.org/drawingml/2006/main">
+              <a:graphicData uri="http://schemas.openxmlformats.org/drawingml/2006/picture">
+                <pic:pic xmlns:pic="http://schemas.openxmlformats.org/drawingml/2006/picture">
+                  <pic:nvPicPr>
+                    <pic:cNvPr id="1" name=""/>
+                    <pic:cNvPicPr/>
+                  </pic:nvPicPr>
+                  <pic:blipFill>
+                    <a:blip r:embed="rId15"/>
+                    <a:stretch>
+                      <a:fillRect/>
+                    </a:stretch>
+                  </pic:blipFill>
+                  <pic:spPr>
+                    <a:xfrm>
+                      <a:off x="0" y="0"/>
+                      <a:ext cx="3648584" cy="5563376"/>
+                    </a:xfrm>
+                    <a:prstGeom prst="rect">
+                      <a:avLst/>
+                    </a:prstGeom>
+                  </pic:spPr>
+                </pic:pic>
+              </a:graphicData>
+            </a:graphic>
+          </wp:inline>
+        </w:drawing>
+      </w:r>
+    </w:p>
+    <w:p>
+      <w:pPr>
+        <w:pStyle w:val="VCText"/>
+      </w:pPr>
+    </w:p>
+    <w:p>
+      <w:pPr>
+        <w:pStyle w:val="VCText"/>
+      </w:pPr>
+      <w:r>
+        <w:t>Add goal screen: This screen is used for users to initialise new milestones for them to reach. The screen has fields for the goals name, total amount and the amount the user is initialling putting towards the goal, this information sets the foundation for tracking the goal in future.</w:t>
+      </w:r>
+    </w:p>
+    <w:p>
+      <w:pPr>
+        <w:pStyle w:val="VCText"/>
+      </w:pPr>
+      <w:r>
+        <w:lastRenderedPageBreak/>
+        <w:drawing>
+          <wp:inline distT="0" distB="0" distL="0" distR="0" wp14:anchorId="0BB15734" wp14:editId="2D6B2954">
+            <wp:extent cx="3439005" cy="7182852"/>
+            <wp:effectExtent l="0" t="0" r="9525" b="0"/>
+            <wp:docPr id="1" name="Picture 1"/>
+            <wp:cNvGraphicFramePr>
+              <a:graphicFrameLocks xmlns:a="http://schemas.openxmlformats.org/drawingml/2006/main" noChangeAspect="1"/>
+            </wp:cNvGraphicFramePr>
+            <a:graphic xmlns:a="http://schemas.openxmlformats.org/drawingml/2006/main">
+              <a:graphicData uri="http://schemas.openxmlformats.org/drawingml/2006/picture">
+                <pic:pic xmlns:pic="http://schemas.openxmlformats.org/drawingml/2006/picture">
+                  <pic:nvPicPr>
+                    <pic:cNvPr id="1" name=""/>
+                    <pic:cNvPicPr/>
+                  </pic:nvPicPr>
+                  <pic:blipFill>
+                    <a:blip r:embed="rId16"/>
+                    <a:stretch>
+                      <a:fillRect/>
+                    </a:stretch>
+                  </pic:blipFill>
+                  <pic:spPr>
+                    <a:xfrm>
+                      <a:off x="0" y="0"/>
+                      <a:ext cx="3439005" cy="7182852"/>
+                    </a:xfrm>
+                    <a:prstGeom prst="rect">
+                      <a:avLst/>
+                    </a:prstGeom>
+                  </pic:spPr>
+                </pic:pic>
+              </a:graphicData>
+            </a:graphic>
+          </wp:inline>
+        </w:drawing>
+      </w:r>
+    </w:p>
+    <w:p>
+      <w:pPr>
+        <w:pStyle w:val="VCText"/>
+      </w:pPr>
+      <w:r>
+        <w:t>Edit goal screen: This extension of the goals screen allows the user to record progress they are making in saving towards a goal, adjust the name or target amount of the goal or delete the goal entirely.</w:t>
+      </w:r>
+    </w:p>
+    <w:p>
+      <w:pPr>
+        <w:pStyle w:val="VCText"/>
+      </w:pPr>
+      <w:r>
+        <w:lastRenderedPageBreak/>
+        <w:t>User flow diagram:</w:t>
+      </w:r>
+      <w:r>
+        <w:br/>
+      </w:r>
+      <w:r>
+        <w:drawing>
+          <wp:inline distT="0" distB="0" distL="0" distR="0" wp14:anchorId="031D4147" wp14:editId="145DF865">
+            <wp:extent cx="5731510" cy="3503443"/>
+            <wp:effectExtent l="0" t="0" r="2540" b="1905"/>
+            <wp:docPr id="2" name="Picture 2" descr="C:\Users\user-pc\Downloads\Emerald_wallet_user_flow.jpg"/>
+            <wp:cNvGraphicFramePr>
+              <a:graphicFrameLocks xmlns:a="http://schemas.openxmlformats.org/drawingml/2006/main" noChangeAspect="1"/>
+            </wp:cNvGraphicFramePr>
+            <a:graphic xmlns:a="http://schemas.openxmlformats.org/drawingml/2006/main">
+              <a:graphicData uri="http://schemas.openxmlformats.org/drawingml/2006/picture">
+                <pic:pic xmlns:pic="http://schemas.openxmlformats.org/drawingml/2006/picture">
+                  <pic:nvPicPr>
+                    <pic:cNvPr id="0" name="Picture 1" descr="C:\Users\user-pc\Downloads\Emerald_wallet_user_flow.jpg"/>
+                    <pic:cNvPicPr>
+                      <a:picLocks noChangeAspect="1" noChangeArrowheads="1"/>
+                    </pic:cNvPicPr>
+                  </pic:nvPicPr>
+                  <pic:blipFill>
+                    <a:blip r:embed="rId17">
+                      <a:extLst>
+                        <a:ext uri="{28A0092B-C50C-407E-A947-70E740481C1C}">
+                          <a14:useLocalDpi xmlns:a14="http://schemas.microsoft.com/office/drawing/2010/main" val="0"/>
+                        </a:ext>
+                      </a:extLst>
+                    </a:blip>
+                    <a:srcRect/>
+                    <a:stretch>
+                      <a:fillRect/>
+                    </a:stretch>
+                  </pic:blipFill>
+                  <pic:spPr bwMode="auto">
+                    <a:xfrm>
+                      <a:off x="0" y="0"/>
+                      <a:ext cx="5731510" cy="3503443"/>
+                    </a:xfrm>
+                    <a:prstGeom prst="rect">
+                      <a:avLst/>
+                    </a:prstGeom>
+                    <a:noFill/>
+                    <a:ln>
+                      <a:noFill/>
+                    </a:ln>
+                  </pic:spPr>
+                </pic:pic>
+              </a:graphicData>
+            </a:graphic>
+          </wp:inline>
+        </w:drawing>
+      </w:r>
+    </w:p>
+    <w:p>
+      <w:pPr>
+        <w:pStyle w:val="VCText"/>
+      </w:pPr>
     </w:p>
     <w:p>
       <w:pPr>
@@ -3157,34 +3648,20 @@
       <w:pPr>
         <w:pStyle w:val="VCText"/>
       </w:pPr>
-      <w:proofErr w:type="spellStart"/>
-      <w:r>
-        <w:t>Goodbudget</w:t>
-      </w:r>
-      <w:proofErr w:type="spellEnd"/>
-      <w:r>
-        <w:t xml:space="preserve">, 2024. </w:t>
-      </w:r>
-      <w:proofErr w:type="spellStart"/>
+      <w:r>
+        <w:t xml:space="preserve">Goodbudget, 2024. </w:t>
+      </w:r>
       <w:r>
         <w:rPr>
           <w:i/>
           <w:iCs/>
         </w:rPr>
-        <w:t>Goodbudget</w:t>
-      </w:r>
-      <w:proofErr w:type="spellEnd"/>
-      <w:r>
-        <w:rPr>
-          <w:i/>
-          <w:iCs/>
-        </w:rPr>
-        <w:t xml:space="preserve"> budgeting methodology.</w:t>
+        <w:t>Goodbudget budgeting methodology.</w:t>
       </w:r>
       <w:r>
         <w:t xml:space="preserve"> Available at: </w:t>
       </w:r>
-      <w:hyperlink r:id="rId8" w:tgtFrame="_new" w:history="1">
+      <w:hyperlink r:id="rId18" w:tgtFrame="_new" w:history="1">
         <w:r>
           <w:rPr>
             <w:rStyle w:val="Hyperlink"/>
@@ -3219,26 +3696,17 @@
       <w:r>
         <w:t xml:space="preserve">Quicken, 2024. </w:t>
       </w:r>
-      <w:proofErr w:type="spellStart"/>
       <w:r>
         <w:rPr>
           <w:i/>
           <w:iCs/>
         </w:rPr>
-        <w:t>Simplifi</w:t>
-      </w:r>
-      <w:proofErr w:type="spellEnd"/>
-      <w:r>
-        <w:rPr>
-          <w:i/>
-          <w:iCs/>
-        </w:rPr>
-        <w:t xml:space="preserve"> budgeting features.</w:t>
+        <w:t>Simplifi budgeting features.</w:t>
       </w:r>
       <w:r>
         <w:t xml:space="preserve"> Available at: </w:t>
       </w:r>
-      <w:hyperlink r:id="rId9" w:tgtFrame="_new" w:history="1">
+      <w:hyperlink r:id="rId19" w:tgtFrame="_new" w:history="1">
         <w:r>
           <w:rPr>
             <w:rStyle w:val="Hyperlink"/>
@@ -3263,28 +3731,12 @@
           <w:i/>
           <w:iCs/>
         </w:rPr>
-        <w:t xml:space="preserve">You Need </w:t>
-      </w:r>
-      <w:proofErr w:type="gramStart"/>
-      <w:r>
-        <w:rPr>
-          <w:i/>
-          <w:iCs/>
-        </w:rPr>
-        <w:t>A</w:t>
-      </w:r>
-      <w:proofErr w:type="gramEnd"/>
-      <w:r>
-        <w:rPr>
-          <w:i/>
-          <w:iCs/>
-        </w:rPr>
-        <w:t xml:space="preserve"> Budget methodology.</w:t>
+        <w:t>You Need A Budget methodology.</w:t>
       </w:r>
       <w:r>
         <w:t xml:space="preserve"> Available at: </w:t>
       </w:r>
-      <w:hyperlink r:id="rId10" w:tgtFrame="_new" w:history="1">
+      <w:hyperlink r:id="rId20" w:tgtFrame="_new" w:history="1">
         <w:r>
           <w:rPr>
             <w:rStyle w:val="Hyperlink"/>
@@ -3302,9 +3754,203 @@
         <w:pStyle w:val="VCText"/>
       </w:pPr>
     </w:p>
+    <w:p>
+      <w:pPr>
+        <w:pStyle w:val="VCHeading"/>
+      </w:pPr>
+      <w:r>
+        <w:t>Disclosures</w:t>
+      </w:r>
+    </w:p>
+    <w:p>
+      <w:pPr>
+        <w:pStyle w:val="VCText"/>
+        <w:rPr>
+          <w:b/>
+          <w:bCs/>
+          <w:sz w:val="28"/>
+          <w:szCs w:val="28"/>
+        </w:rPr>
+      </w:pPr>
+      <w:r>
+        <w:rPr>
+          <w:b/>
+          <w:bCs/>
+          <w:sz w:val="28"/>
+          <w:szCs w:val="28"/>
+        </w:rPr>
+        <w:t>Annexure A</w:t>
+      </w:r>
+    </w:p>
+    <w:p>
+      <w:pPr>
+        <w:pStyle w:val="VCText"/>
+      </w:pPr>
+      <w:r>
+        <w:t>Title: Disclosure of AI that is used in my assignment.</w:t>
+      </w:r>
+    </w:p>
+    <w:p>
+      <w:pPr>
+        <w:pStyle w:val="VCText"/>
+      </w:pPr>
+      <w:r>
+        <w:t>Name: OpenAI</w:t>
+      </w:r>
+    </w:p>
+    <w:p>
+      <w:pPr>
+        <w:pStyle w:val="VCText"/>
+      </w:pPr>
+      <w:r>
+        <w:t>Section: Research</w:t>
+      </w:r>
+    </w:p>
+    <w:p>
+      <w:pPr>
+        <w:pStyle w:val="VCText"/>
+      </w:pPr>
+      <w:r>
+        <w:t>Purpose: Used for help with research and understanding</w:t>
+      </w:r>
+    </w:p>
+    <w:p>
+      <w:pPr>
+        <w:pStyle w:val="VCText"/>
+      </w:pPr>
+      <w:r>
+        <w:t xml:space="preserve">Date: </w:t>
+      </w:r>
+      <w:r>
+        <w:t xml:space="preserve">15 </w:t>
+      </w:r>
+      <w:r>
+        <w:t>March 2026</w:t>
+      </w:r>
+    </w:p>
+    <w:p>
+      <w:pPr>
+        <w:pStyle w:val="VCText"/>
+      </w:pPr>
+      <w:r>
+        <w:t xml:space="preserve">Link: </w:t>
+      </w:r>
+      <w:r>
+        <w:t>https://chatgpt.com/c/69b8f8bf-3eac-8329-b346-c2d4f2429dc4</w:t>
+      </w:r>
+    </w:p>
+    <w:p>
+      <w:pPr>
+        <w:pStyle w:val="VCText"/>
+      </w:pPr>
+    </w:p>
+    <w:p>
+      <w:pPr>
+        <w:pStyle w:val="VCText"/>
+        <w:rPr>
+          <w:b/>
+          <w:bCs/>
+          <w:sz w:val="28"/>
+          <w:szCs w:val="28"/>
+        </w:rPr>
+      </w:pPr>
+      <w:r>
+        <w:rPr>
+          <w:b/>
+          <w:bCs/>
+          <w:sz w:val="28"/>
+          <w:szCs w:val="28"/>
+        </w:rPr>
+        <w:t>Annexure B</w:t>
+      </w:r>
+    </w:p>
+    <w:p>
+      <w:pPr>
+        <w:pStyle w:val="VCText"/>
+      </w:pPr>
+      <w:r>
+        <w:t xml:space="preserve">Title: Disclosure of </w:t>
+      </w:r>
+      <w:r>
+        <w:t>draw.io</w:t>
+      </w:r>
+      <w:r>
+        <w:t xml:space="preserve"> that is used in my assignment.</w:t>
+      </w:r>
+    </w:p>
+    <w:p>
+      <w:pPr>
+        <w:pStyle w:val="VCText"/>
+      </w:pPr>
+      <w:r>
+        <w:t xml:space="preserve">Name: </w:t>
+      </w:r>
+      <w:r>
+        <w:t>draw.io</w:t>
+      </w:r>
+    </w:p>
+    <w:p>
+      <w:pPr>
+        <w:pStyle w:val="VCText"/>
+      </w:pPr>
+      <w:r>
+        <w:t>Section: Infographic</w:t>
+      </w:r>
+    </w:p>
+    <w:p>
+      <w:pPr>
+        <w:pStyle w:val="VCText"/>
+      </w:pPr>
+      <w:r>
+        <w:t>Purpose: Used to create the infographic</w:t>
+      </w:r>
+    </w:p>
+    <w:p>
+      <w:pPr>
+        <w:pStyle w:val="VCText"/>
+      </w:pPr>
+      <w:r>
+        <w:t xml:space="preserve">Date: </w:t>
+      </w:r>
+      <w:r>
+        <w:t>16</w:t>
+      </w:r>
+      <w:r>
+        <w:t xml:space="preserve"> March 2026</w:t>
+      </w:r>
+    </w:p>
+    <w:p>
+      <w:pPr>
+        <w:pStyle w:val="VCText"/>
+      </w:pPr>
+      <w:r>
+        <w:t xml:space="preserve">Link: </w:t>
+      </w:r>
+      <w:hyperlink r:id="rId21" w:history="1">
+        <w:r>
+          <w:rPr>
+            <w:rStyle w:val="Hyperlink"/>
+          </w:rPr>
+          <w:t>https://www.drawio.com/</w:t>
+        </w:r>
+      </w:hyperlink>
+      <w:r>
+        <w:t xml:space="preserve"> </w:t>
+      </w:r>
+    </w:p>
+    <w:p>
+      <w:pPr>
+        <w:pStyle w:val="VCText"/>
+      </w:pPr>
+    </w:p>
+    <w:p>
+      <w:pPr>
+        <w:pStyle w:val="VCText"/>
+      </w:pPr>
+    </w:p>
     <w:sectPr>
-      <w:headerReference w:type="default" r:id="rId11"/>
-      <w:footerReference w:type="default" r:id="rId12"/>
+      <w:headerReference w:type="default" r:id="rId22"/>
+      <w:footerReference w:type="default" r:id="rId23"/>
       <w:pgSz w:w="11906" w:h="16838"/>
       <w:pgMar w:top="1440" w:right="1440" w:bottom="1440" w:left="1440" w:header="708" w:footer="708" w:gutter="0"/>
       <w:pgNumType w:start="0"/>
@@ -7374,6 +8020,119 @@
     </w:lvl>
   </w:abstractNum>
   <w:abstractNum w:abstractNumId="26" w15:restartNumberingAfterBreak="0">
+    <w:nsid w:val="69E53D46"/>
+    <w:multiLevelType w:val="hybridMultilevel"/>
+    <w:tmpl w:val="D3AC16E2"/>
+    <w:lvl w:ilvl="0" w:tplc="1C090001">
+      <w:start w:val="1"/>
+      <w:numFmt w:val="bullet"/>
+      <w:lvlText w:val=""/>
+      <w:lvlJc w:val="left"/>
+      <w:pPr>
+        <w:ind w:left="720" w:hanging="360"/>
+      </w:pPr>
+      <w:rPr>
+        <w:rFonts w:ascii="Symbol" w:hAnsi="Symbol" w:hint="default"/>
+      </w:rPr>
+    </w:lvl>
+    <w:lvl w:ilvl="1" w:tplc="1C090003" w:tentative="1">
+      <w:start w:val="1"/>
+      <w:numFmt w:val="bullet"/>
+      <w:lvlText w:val="o"/>
+      <w:lvlJc w:val="left"/>
+      <w:pPr>
+        <w:ind w:left="1440" w:hanging="360"/>
+      </w:pPr>
+      <w:rPr>
+        <w:rFonts w:ascii="Courier New" w:hAnsi="Courier New" w:cs="Courier New" w:hint="default"/>
+      </w:rPr>
+    </w:lvl>
+    <w:lvl w:ilvl="2" w:tplc="1C090005" w:tentative="1">
+      <w:start w:val="1"/>
+      <w:numFmt w:val="bullet"/>
+      <w:lvlText w:val=""/>
+      <w:lvlJc w:val="left"/>
+      <w:pPr>
+        <w:ind w:left="2160" w:hanging="360"/>
+      </w:pPr>
+      <w:rPr>
+        <w:rFonts w:ascii="Wingdings" w:hAnsi="Wingdings" w:hint="default"/>
+      </w:rPr>
+    </w:lvl>
+    <w:lvl w:ilvl="3" w:tplc="1C090001" w:tentative="1">
+      <w:start w:val="1"/>
+      <w:numFmt w:val="bullet"/>
+      <w:lvlText w:val=""/>
+      <w:lvlJc w:val="left"/>
+      <w:pPr>
+        <w:ind w:left="2880" w:hanging="360"/>
+      </w:pPr>
+      <w:rPr>
+        <w:rFonts w:ascii="Symbol" w:hAnsi="Symbol" w:hint="default"/>
+      </w:rPr>
+    </w:lvl>
+    <w:lvl w:ilvl="4" w:tplc="1C090003" w:tentative="1">
+      <w:start w:val="1"/>
+      <w:numFmt w:val="bullet"/>
+      <w:lvlText w:val="o"/>
+      <w:lvlJc w:val="left"/>
+      <w:pPr>
+        <w:ind w:left="3600" w:hanging="360"/>
+      </w:pPr>
+      <w:rPr>
+        <w:rFonts w:ascii="Courier New" w:hAnsi="Courier New" w:cs="Courier New" w:hint="default"/>
+      </w:rPr>
+    </w:lvl>
+    <w:lvl w:ilvl="5" w:tplc="1C090005" w:tentative="1">
+      <w:start w:val="1"/>
+      <w:numFmt w:val="bullet"/>
+      <w:lvlText w:val=""/>
+      <w:lvlJc w:val="left"/>
+      <w:pPr>
+        <w:ind w:left="4320" w:hanging="360"/>
+      </w:pPr>
+      <w:rPr>
+        <w:rFonts w:ascii="Wingdings" w:hAnsi="Wingdings" w:hint="default"/>
+      </w:rPr>
+    </w:lvl>
+    <w:lvl w:ilvl="6" w:tplc="1C090001" w:tentative="1">
+      <w:start w:val="1"/>
+      <w:numFmt w:val="bullet"/>
+      <w:lvlText w:val=""/>
+      <w:lvlJc w:val="left"/>
+      <w:pPr>
+        <w:ind w:left="5040" w:hanging="360"/>
+      </w:pPr>
+      <w:rPr>
+        <w:rFonts w:ascii="Symbol" w:hAnsi="Symbol" w:hint="default"/>
+      </w:rPr>
+    </w:lvl>
+    <w:lvl w:ilvl="7" w:tplc="1C090003" w:tentative="1">
+      <w:start w:val="1"/>
+      <w:numFmt w:val="bullet"/>
+      <w:lvlText w:val="o"/>
+      <w:lvlJc w:val="left"/>
+      <w:pPr>
+        <w:ind w:left="5760" w:hanging="360"/>
+      </w:pPr>
+      <w:rPr>
+        <w:rFonts w:ascii="Courier New" w:hAnsi="Courier New" w:cs="Courier New" w:hint="default"/>
+      </w:rPr>
+    </w:lvl>
+    <w:lvl w:ilvl="8" w:tplc="1C090005" w:tentative="1">
+      <w:start w:val="1"/>
+      <w:numFmt w:val="bullet"/>
+      <w:lvlText w:val=""/>
+      <w:lvlJc w:val="left"/>
+      <w:pPr>
+        <w:ind w:left="6480" w:hanging="360"/>
+      </w:pPr>
+      <w:rPr>
+        <w:rFonts w:ascii="Wingdings" w:hAnsi="Wingdings" w:hint="default"/>
+      </w:rPr>
+    </w:lvl>
+  </w:abstractNum>
+  <w:abstractNum w:abstractNumId="27" w15:restartNumberingAfterBreak="0">
     <w:nsid w:val="6DE413B9"/>
     <w:multiLevelType w:val="multilevel"/>
     <w:tmpl w:val="B8E4AA82"/>
@@ -7522,7 +8281,7 @@
       </w:rPr>
     </w:lvl>
   </w:abstractNum>
-  <w:abstractNum w:abstractNumId="27" w15:restartNumberingAfterBreak="0">
+  <w:abstractNum w:abstractNumId="28" w15:restartNumberingAfterBreak="0">
     <w:nsid w:val="740D79CE"/>
     <w:multiLevelType w:val="multilevel"/>
     <w:tmpl w:val="60342050"/>
@@ -7671,7 +8430,7 @@
       </w:rPr>
     </w:lvl>
   </w:abstractNum>
-  <w:abstractNum w:abstractNumId="28" w15:restartNumberingAfterBreak="0">
+  <w:abstractNum w:abstractNumId="29" w15:restartNumberingAfterBreak="0">
     <w:nsid w:val="7D8245FB"/>
     <w:multiLevelType w:val="multilevel"/>
     <w:tmpl w:val="C25E3146"/>
@@ -7839,7 +8598,7 @@
     <w:abstractNumId w:val="5"/>
   </w:num>
   <w:num w:numId="7" w16cid:durableId="1933706348">
-    <w:abstractNumId w:val="26"/>
+    <w:abstractNumId w:val="27"/>
   </w:num>
   <w:num w:numId="8" w16cid:durableId="422841109">
     <w:abstractNumId w:val="23"/>
@@ -7848,7 +8607,7 @@
     <w:abstractNumId w:val="21"/>
   </w:num>
   <w:num w:numId="10" w16cid:durableId="72361897">
-    <w:abstractNumId w:val="27"/>
+    <w:abstractNumId w:val="28"/>
   </w:num>
   <w:num w:numId="11" w16cid:durableId="325279510">
     <w:abstractNumId w:val="10"/>
@@ -7881,7 +8640,7 @@
     <w:abstractNumId w:val="19"/>
   </w:num>
   <w:num w:numId="21" w16cid:durableId="1482309497">
-    <w:abstractNumId w:val="28"/>
+    <w:abstractNumId w:val="29"/>
   </w:num>
   <w:num w:numId="22" w16cid:durableId="909384902">
     <w:abstractNumId w:val="20"/>
@@ -7906,6 +8665,9 @@
   </w:num>
   <w:num w:numId="29" w16cid:durableId="505094153">
     <w:abstractNumId w:val="9"/>
+  </w:num>
+  <w:num w:numId="30" w16cid:durableId="2045904134">
+    <w:abstractNumId w:val="26"/>
   </w:num>
 </w:numbering>
 </file>
@@ -8969,6 +9731,18 @@
       <w:shd w:val="clear" w:color="auto" w:fill="E1DFDD"/>
     </w:rPr>
   </w:style>
+  <w:style w:type="character" w:styleId="FollowedHyperlink">
+    <w:name w:val="FollowedHyperlink"/>
+    <w:basedOn w:val="DefaultParagraphFont"/>
+    <w:uiPriority w:val="99"/>
+    <w:semiHidden/>
+    <w:unhideWhenUsed/>
+    <w:rsid w:val="00797DEE"/>
+    <w:rPr>
+      <w:color w:val="96607D" w:themeColor="followedHyperlink"/>
+      <w:u w:val="single"/>
+    </w:rPr>
+  </w:style>
 </w:styles>
 </file>
 
@@ -9231,8 +10005,10 @@
   </w:compat>
   <w:rsids>
     <w:rsidRoot w:val="00B53967"/>
+    <w:rsid w:val="002439C5"/>
     <w:rsid w:val="00957270"/>
     <w:rsid w:val="009574D8"/>
+    <w:rsid w:val="00AE362D"/>
     <w:rsid w:val="00B53967"/>
     <w:rsid w:val="00B57ADC"/>
     <w:rsid w:val="00C72888"/>

</xml_diff>